<commit_message>
Case 1 v6: apply 3 council fixes + ХБП notation tightened
- ABPM line rewritten to remove apparent contradiction. Now reads
  as two independent ABPM parameters: dipping pattern (normal,
  dipper) AND absolute night BP (≥120/70 → night hypertension by
  MoH RF AH-2024).
- Step 2: titration of bisoprolol 5 → 10 mg attributed to
  "по решению лечащего врача" — removes the risk of a sales rep
  reproducing the slide as a standalone dosing algorithm.
- Step 3 rewritten with explicit narrative answering the audience's
  first likely question — "why switch a stable patient?". Now
  states: patient stabilized on free combination for 4 weeks
  (targets achieved) → switch per Concor AM label condition (same
  doses from monocomponents) → goal: adherence + Verma 2018 hard
  endpoints.
- CKD notation: "ХБП С2 А2" → "ХБП С2А2" (no space, per user).

https://claude.ai/code/session_01Ar9z3rDbBhB3wMjA9xSC63
</commit_message>
<xml_diff>
--- a/tasks/slides/2026-05-18_konkor-am-nst_case-1.docx
+++ b/tasks/slides/2026-05-18_konkor-am-nst_case-1.docx
@@ -310,7 +310,7 @@
         <w:t xml:space="preserve"> </w:t>
       </w:r>
       <w:r>
-        <w:t xml:space="preserve">- АД 152/92 мм рт.ст. (СМАД: дневное 148/90, ночное 132/78 — нормальное ночное снижение; ночная гипертензия по КР МЗ РФ АГ-2024 — ночное АД ≥120/70).</w:t>
+        <w:t xml:space="preserve">- АД 152/92 мм рт.ст. (СМАД: дневное 148/90, ночное 132/78 мм рт.ст. Характер снижения — нормальный (диппер); при этом ночное АД ≥120/70 → ночная гипертензия по КР МЗ РФ АГ-2024).</w:t>
       </w:r>
       <w:r>
         <w:t xml:space="preserve"> </w:t>
@@ -510,7 +510,7 @@
         <w:t xml:space="preserve"> </w:t>
       </w:r>
       <w:r>
-        <w:t xml:space="preserve">&gt; ХБП С2 А2 (СКФ CKD-EPI 84 мл/мин/1,73 м²; альбумин/креатинин мочи 65 мг/г).</w:t>
+        <w:t xml:space="preserve">&gt; ХБП С2А2 (СКФ CKD-EPI 84 мл/мин/1,73 м²; альбумин/креатинин мочи 65 мг/г).</w:t>
       </w:r>
       <w:r>
         <w:t xml:space="preserve"> </w:t>
@@ -636,20 +636,23 @@
         <w:t xml:space="preserve">амлодипин 5 мг утром</w:t>
       </w:r>
       <w:r>
-        <w:t xml:space="preserve">; одновременно по динамике ЧСС доза</w:t>
-      </w:r>
-      <w:r>
-        <w:t xml:space="preserve"> </w:t>
-      </w:r>
-      <w:r>
-        <w:rPr>
-          <w:bCs/>
-          <w:b/>
-        </w:rPr>
-        <w:t xml:space="preserve">Конкора увеличена с 5 до 10 мг</w:t>
-      </w:r>
-      <w:r>
-        <w:t xml:space="preserve">.</w:t>
+        <w:t xml:space="preserve">;</w:t>
+      </w:r>
+      <w:r>
+        <w:t xml:space="preserve"> </w:t>
+      </w:r>
+      <w:r>
+        <w:rPr>
+          <w:bCs/>
+          <w:b/>
+        </w:rPr>
+        <w:t xml:space="preserve">по решению лечащего врача</w:t>
+      </w:r>
+      <w:r>
+        <w:t xml:space="preserve"> </w:t>
+      </w:r>
+      <w:r>
+        <w:t xml:space="preserve">доза Конкора увеличена с 5 до 10 мг (по динамике ЧСС).</w:t>
       </w:r>
       <w:r>
         <w:t xml:space="preserve"> </w:t>
@@ -677,13 +680,29 @@
           <w:bCs/>
           <w:b/>
         </w:rPr>
-        <w:t xml:space="preserve">Шаг 3. Перевод на Конкор АМ 10/5 мг утром</w:t>
-      </w:r>
-      <w:r>
-        <w:t xml:space="preserve"> </w:t>
-      </w:r>
-      <w:r>
-        <w:t xml:space="preserve">— switch со свободной комбинации бисопролол 10 мг + амлодипин 5 мг в тех же дозах. Валсартан 160 мг утром сохраняется.</w:t>
+        <w:t xml:space="preserve">Шаг 3.</w:t>
+      </w:r>
+      <w:r>
+        <w:t xml:space="preserve"> </w:t>
+      </w:r>
+      <w:r>
+        <w:t xml:space="preserve">Пациент стабилизирован на свободной комбинации бисопролол 10 мг + амлодипин 5 мг в течение 4 нед: целевое АД достигнуто, ЧСС в диапазоне 55–60, приступов нет. По инструкции Конкор АМ показание — switch с эквивалентных доз монокомпонентов.</w:t>
+      </w:r>
+      <w:r>
+        <w:t xml:space="preserve"> </w:t>
+      </w:r>
+      <w:r>
+        <w:rPr>
+          <w:bCs/>
+          <w:b/>
+        </w:rPr>
+        <w:t xml:space="preserve">Перевод на Конкор АМ 10/5 мг утром</w:t>
+      </w:r>
+      <w:r>
+        <w:t xml:space="preserve"> </w:t>
+      </w:r>
+      <w:r>
+        <w:t xml:space="preserve">— для повышения приверженности и FDC-ассоциированного снижения твёрдых конечных точек (Verma 2018). Валсартан 160 мг утром сохраняется.</w:t>
       </w:r>
     </w:p>
     <w:p>

</xml_diff>

<commit_message>
Case 1 v6.1: strengthen COPD wording per Concor AM SmPC
User confirmed Concor AM SmPC (loaded into main) explicitly limits
COPD precaution to SEVERE COPD; mild COPD (GOLD 1) is neither a
contraindication nor a precaution. Updated USP wording to reflect
this directly with reference to the SmPC, which is stronger and
regulatorily cleaner than the previous "допустим при ХОБЛ лёгкой
степени" phrasing.

SEPARATE OPEN ISSUE (not yet applied): Concor AM section 4.1
registers the product for HYPERTENSION only as a switch from
monocomponents. Our patient has HTN + newly diagnosed CAD, which
is outside the registered indication and requires an off-label
disclaimer per decisions/2026-05-18_slide-building-principles.md
rule 4. The previous council session missed this. Three formulation
options proposed to user — awaiting decision.

https://claude.ai/code/session_01Ar9z3rDbBhB3wMjA9xSC63
</commit_message>
<xml_diff>
--- a/tasks/slides/2026-05-18_konkor-am-nst_case-1.docx
+++ b/tasks/slides/2026-05-18_konkor-am-nst_case-1.docx
@@ -826,13 +826,26 @@
           <w:bCs/>
           <w:b/>
         </w:rPr>
-        <w:t xml:space="preserve">Кардиоселективность бисопролола сохраняется в дозе 10 мг</w:t>
-      </w:r>
-      <w:r>
-        <w:t xml:space="preserve"> </w:t>
-      </w:r>
-      <w:r>
-        <w:t xml:space="preserve">→ допустим при ХОБЛ лёгкой степени (GOLD 1).</w:t>
+        <w:t xml:space="preserve">Применение при ХОБЛ.</w:t>
+      </w:r>
+      <w:r>
+        <w:t xml:space="preserve"> </w:t>
+      </w:r>
+      <w:r>
+        <w:t xml:space="preserve">По ОХЛП Конкор АМ ограничения по ХОБЛ касаются только тяжёлых форм («с осторожностью»); противопоказание — только тяжёлые формы бронхиальной астмы.</w:t>
+      </w:r>
+      <w:r>
+        <w:t xml:space="preserve"> </w:t>
+      </w:r>
+      <w:r>
+        <w:rPr>
+          <w:bCs/>
+          <w:b/>
+        </w:rPr>
+        <w:t xml:space="preserve">ХОБЛ лёгкой степени (GOLD 1) не входит ни в противопоказания, ни в меры предосторожности</w:t>
+      </w:r>
+      <w:r>
+        <w:t xml:space="preserve">; кардиоселективность бисопролола (β1) минимизирует риск бронхообструкции.</w:t>
       </w:r>
     </w:p>
     <w:p>

</xml_diff>

<commit_message>
Case 1 v6.2: realistic timeline + spirometry reversibility test
Two clinical fixes flagged by user that both council iterations
missed:

1. Inter-step timing reduced from a flat 4 weeks to realistic
   intervals. Step 1: 2 wk (β-blocker effect on resting HR and
   angina visible within 1–2 wk in a symptomatic CAD patient).
   Step 2: 3 wk (combined β-blocker uptitration + amlodipine
   addition reaches steady state in 2–4 wk). Step 3: 2–4 wk
   stabilization on free combination before switch.

2. Spirometry now reports pre- and post-bronchodilator values
   (pre 0.64 / 78%; post 0.66 / 82%) with explicit reversibility
   calculation (~5%, ~160 mL — below the 12% / 200 mL threshold).
   This rules out asthma and asthma-COPD overlap, not just COPD
   stage. Critical because patient is a 12.5 pack-year smoker
   with morning cough and sputum — ACO is a real differential.

https://claude.ai/code/session_01Ar9z3rDbBhB3wMjA9xSC63
</commit_message>
<xml_diff>
--- a/tasks/slides/2026-05-18_konkor-am-nst_case-1.docx
+++ b/tasks/slides/2026-05-18_konkor-am-nst_case-1.docx
@@ -438,13 +438,13 @@
           <w:bCs/>
           <w:b/>
         </w:rPr>
-        <w:t xml:space="preserve">Спирометрия (постбронходилатационная):</w:t>
-      </w:r>
-      <w:r>
-        <w:t xml:space="preserve"> </w:t>
-      </w:r>
-      <w:r>
-        <w:t xml:space="preserve">ОФВ1/ФЖЕЛ 0,66 (&lt;0,70), ОФВ1 82% от должного — обструкция лёгкой степени, диагноз ХОБЛ верифицирован.</w:t>
+        <w:t xml:space="preserve">Спирометрия:</w:t>
+      </w:r>
+      <w:r>
+        <w:t xml:space="preserve"> </w:t>
+      </w:r>
+      <w:r>
+        <w:t xml:space="preserve">исходно — ОФВ1/ФЖЕЛ 0,64, ОФВ1 78% от должного; постбронходилатационная (после 400 мкг сальбутамола) — ОФВ1/ФЖЕЛ 0,66, ОФВ1 82% от должного. Прирост ОФВ1 ~5% (~160 мл) — значимая обратимость отсутствует (порог ≥12% и ≥200 мл) → диагноз ХОБЛ верифицирован (GOLD 1); бронхиальная астма и asthma-COPD overlap исключены.</w:t>
       </w:r>
     </w:p>
     <w:p>
@@ -599,7 +599,7 @@
           <w:iCs/>
           <w:i/>
         </w:rPr>
-        <w:t xml:space="preserve">Через 4 нед:</w:t>
+        <w:t xml:space="preserve">Через 2 нед:</w:t>
       </w:r>
       <w:r>
         <w:t xml:space="preserve"> </w:t>
@@ -662,7 +662,7 @@
           <w:iCs/>
           <w:i/>
         </w:rPr>
-        <w:t xml:space="preserve">Через 4 нед:</w:t>
+        <w:t xml:space="preserve">Через 3 нед:</w:t>
       </w:r>
       <w:r>
         <w:t xml:space="preserve"> </w:t>
@@ -686,7 +686,7 @@
         <w:t xml:space="preserve"> </w:t>
       </w:r>
       <w:r>
-        <w:t xml:space="preserve">Пациент стабилизирован на свободной комбинации бисопролол 10 мг + амлодипин 5 мг в течение 4 нед: целевое АД достигнуто, ЧСС в диапазоне 55–60, приступов нет. По инструкции Конкор АМ показание — switch с эквивалентных доз монокомпонентов.</w:t>
+        <w:t xml:space="preserve">Пациент стабилизирован на свободной комбинации бисопролол 10 мг + амлодипин 5 мг в течение 2–4 нед: целевое АД достигнуто, ЧСС в диапазоне 55–60, приступов нет. По инструкции Конкор АМ показание — switch с эквивалентных доз монокомпонентов.</w:t>
       </w:r>
       <w:r>
         <w:t xml:space="preserve"> </w:t>

</xml_diff>